<commit_message>
Fix docxtemplater error and add export to PNG feature
</commit_message>
<xml_diff>
--- a/timesheet/template.docx
+++ b/timesheet/template.docx
@@ -10,7 +10,7 @@
         <w:rPr>
           <w:sz w:val="56"/>
         </w:rPr>
-        <w:t>鐘 點 簽 名 表 ({{className}} -- {{name}} - {{monthName}} {{year}})</w:t>
+        <w:t>鐘 點 簽 名 表 ({className} -- {name} - {monthName} {year})</w:t>
       </w:r>
     </w:p>
     <w:p>
@@ -292,7 +292,7 @@
               <w:rPr>
                 <w:sz w:val="28"/>
               </w:rPr>
-              <w:t>{#days}{{rowIndex}}</w:t>
+              <w:t>{#days}{rowIndex}</w:t>
             </w:r>
           </w:p>
         </w:tc>
@@ -306,7 +306,7 @@
               <w:rPr>
                 <w:sz w:val="28"/>
               </w:rPr>
-              <w:t>{{date}}</w:t>
+              <w:t>{date}</w:t>
             </w:r>
           </w:p>
         </w:tc>
@@ -320,7 +320,7 @@
               <w:rPr>
                 <w:sz w:val="28"/>
               </w:rPr>
-              <w:t>{{className}}</w:t>
+              <w:t>{className}</w:t>
             </w:r>
           </w:p>
         </w:tc>
@@ -334,7 +334,7 @@
               <w:rPr>
                 <w:sz w:val="28"/>
               </w:rPr>
-              <w:t>{{time}}</w:t>
+              <w:t>{time}</w:t>
             </w:r>
           </w:p>
         </w:tc>
@@ -348,7 +348,7 @@
               <w:rPr>
                 <w:sz w:val="28"/>
               </w:rPr>
-              <w:t>{{mins}}</w:t>
+              <w:t>{mins}</w:t>
             </w:r>
           </w:p>
         </w:tc>
@@ -365,7 +365,7 @@
               <w:rPr>
                 <w:sz w:val="28"/>
               </w:rPr>
-              <w:t>{{remarks}}{/days}</w:t>
+              <w:t>{remarks}{/days}</w:t>
             </w:r>
           </w:p>
         </w:tc>

</xml_diff>